<commit_message>
Set default document font to Times New Roman
Replace SimSun/CJK_FONT with DEFAULT_FONT across converter, templates,
preview script, and docs. Code blocks remain Consolas.
</commit_message>
<xml_diff>
--- a/.agents/skills/md-to-docx/assets/template.docx
+++ b/.agents/skills/md-to-docx/assets/template.docx
@@ -376,7 +376,7 @@
     <w:qFormat/>
     <w:rsid w:val="00FC693F"/>
     <w:rPr>
-      <w:rFonts w:ascii="Times New Roman" w:hAnsi="Times New Roman" w:eastAsia="SimSun"/>
+      <w:rFonts w:ascii="Times New Roman" w:hAnsi="Times New Roman" w:eastAsia="Times New Roman"/>
       <w:b w:val="0"/>
       <w:sz w:val="24"/>
     </w:rPr>
@@ -440,7 +440,7 @@
       <w:outlineLvl w:val="0"/>
     </w:pPr>
     <w:rPr>
-      <w:rFonts w:asciiTheme="majorHAnsi" w:eastAsiaTheme="majorEastAsia" w:hAnsiTheme="majorHAnsi" w:cstheme="majorBidi" w:ascii="Times New Roman" w:hAnsi="Times New Roman" w:eastAsia="SimSun"/>
+      <w:rFonts w:asciiTheme="majorHAnsi" w:eastAsiaTheme="majorEastAsia" w:hAnsiTheme="majorHAnsi" w:cstheme="majorBidi" w:ascii="Times New Roman" w:hAnsi="Times New Roman" w:eastAsia="Times New Roman"/>
       <w:b/>
       <w:bCs/>
       <w:color w:val="365F91" w:themeColor="accent1" w:themeShade="BF"/>
@@ -464,7 +464,7 @@
       <w:outlineLvl w:val="1"/>
     </w:pPr>
     <w:rPr>
-      <w:rFonts w:asciiTheme="majorHAnsi" w:eastAsiaTheme="majorEastAsia" w:hAnsiTheme="majorHAnsi" w:cstheme="majorBidi" w:ascii="Times New Roman" w:hAnsi="Times New Roman" w:eastAsia="SimSun"/>
+      <w:rFonts w:asciiTheme="majorHAnsi" w:eastAsiaTheme="majorEastAsia" w:hAnsiTheme="majorHAnsi" w:cstheme="majorBidi" w:ascii="Times New Roman" w:hAnsi="Times New Roman" w:eastAsia="Times New Roman"/>
       <w:b/>
       <w:bCs/>
       <w:color w:val="4F81BD" w:themeColor="accent1"/>
@@ -488,7 +488,7 @@
       <w:outlineLvl w:val="2"/>
     </w:pPr>
     <w:rPr>
-      <w:rFonts w:asciiTheme="majorHAnsi" w:eastAsiaTheme="majorEastAsia" w:hAnsiTheme="majorHAnsi" w:cstheme="majorBidi" w:ascii="Times New Roman" w:hAnsi="Times New Roman" w:eastAsia="SimSun"/>
+      <w:rFonts w:asciiTheme="majorHAnsi" w:eastAsiaTheme="majorEastAsia" w:hAnsiTheme="majorHAnsi" w:cstheme="majorBidi" w:ascii="Times New Roman" w:hAnsi="Times New Roman" w:eastAsia="Times New Roman"/>
       <w:b/>
       <w:bCs/>
       <w:color w:val="4F81BD" w:themeColor="accent1"/>
@@ -512,7 +512,7 @@
       <w:outlineLvl w:val="3"/>
     </w:pPr>
     <w:rPr>
-      <w:rFonts w:asciiTheme="majorHAnsi" w:eastAsiaTheme="majorEastAsia" w:hAnsiTheme="majorHAnsi" w:cstheme="majorBidi" w:ascii="Times New Roman" w:hAnsi="Times New Roman" w:eastAsia="SimSun"/>
+      <w:rFonts w:asciiTheme="majorHAnsi" w:eastAsiaTheme="majorEastAsia" w:hAnsiTheme="majorHAnsi" w:cstheme="majorBidi" w:ascii="Times New Roman" w:hAnsi="Times New Roman" w:eastAsia="Times New Roman"/>
       <w:b/>
       <w:bCs/>
       <w:i/>
@@ -538,7 +538,7 @@
       <w:outlineLvl w:val="4"/>
     </w:pPr>
     <w:rPr>
-      <w:rFonts w:asciiTheme="majorHAnsi" w:eastAsiaTheme="majorEastAsia" w:hAnsiTheme="majorHAnsi" w:cstheme="majorBidi" w:ascii="Times New Roman" w:hAnsi="Times New Roman" w:eastAsia="SimSun"/>
+      <w:rFonts w:asciiTheme="majorHAnsi" w:eastAsiaTheme="majorEastAsia" w:hAnsiTheme="majorHAnsi" w:cstheme="majorBidi" w:ascii="Times New Roman" w:hAnsi="Times New Roman" w:eastAsia="Times New Roman"/>
       <w:b/>
       <w:color w:val="243F60" w:themeColor="accent1" w:themeShade="7F"/>
       <w:sz w:val="28"/>
@@ -561,7 +561,7 @@
       <w:outlineLvl w:val="5"/>
     </w:pPr>
     <w:rPr>
-      <w:rFonts w:asciiTheme="majorHAnsi" w:eastAsiaTheme="majorEastAsia" w:hAnsiTheme="majorHAnsi" w:cstheme="majorBidi" w:ascii="Times New Roman" w:hAnsi="Times New Roman" w:eastAsia="SimSun"/>
+      <w:rFonts w:asciiTheme="majorHAnsi" w:eastAsiaTheme="majorEastAsia" w:hAnsiTheme="majorHAnsi" w:cstheme="majorBidi" w:ascii="Times New Roman" w:hAnsi="Times New Roman" w:eastAsia="Times New Roman"/>
       <w:b/>
       <w:i/>
       <w:iCs/>

</xml_diff>